<commit_message>
Align creatives and docs with the live homepage; annotate LP screens
The website is the source of truth:
- Regular price 7.200 RSD (was 6.400) in C5, R6, carousel card 7 and docs
- Open Day Mon 26 Oct, 18-20 h (was Sat 24 Oct, ~90 min, free) in C6,
  O2 band, O3 countdown, story, weekly plan, briefs, photo list;
  Open Day flight 12 -> 26 Oct
- Level copy, "6 oblasti", groups start together (R6) as on the site

LP prototype copy aligned with the site (Passport, screen share per
level, site FAQ answers); new annotated mobile screens with comments
in landing-page/annotated/ and in the LP review doc.

Co-Authored-By: Claude Opus 5.5 <noreply@anthropic.com>
Claude-Session: https://claude.ai/code/session_01WYxT2oKqHUxfsBrXZ2Myb2
</commit_message>
<xml_diff>
--- a/nxt-school-launch/NXT_LP_Review.docx
+++ b/nxt-school-launch/NXT_LP_Review.docx
@@ -47,7 +47,7 @@
           <w:sz w:val="15"/>
           <w:szCs w:val="15"/>
         </w:rPr>
-        <w:t xml:space="preserve">6 Oct 2026 · Reviewed: homepage copy, structure, CTAs, form and tags · Traffic: Meta P1–P6, O1–O3, R1–R7 · Prototype: </w:t>
+        <w:t xml:space="preserve">6 Oct 2026 (updated: the live site is the source of truth) · Reviewed: homepage copy, structure, CTAs, form and tags · Traffic: Meta P1–P6, O1–O3, R1–R7 · Prototype: </w:t>
       </w:r>
       <w:r>
         <w:rPr>
@@ -269,7 +269,7 @@
                 <w:sz w:val="15"/>
                 <w:szCs w:val="15"/>
               </w:rPr>
-              <w:t xml:space="preserve">~480 words · 7 blocks · no menu · one action · form on the same page, 5 fields</w:t>
+              <w:t xml:space="preserve">~530 words · 7 blocks · no menu · one action · form on the same page, 5 fields</w:t>
             </w:r>
           </w:p>
         </w:tc>
@@ -319,7 +319,7 @@
                 <w:sz w:val="15"/>
                 <w:szCs w:val="15"/>
               </w:rPr>
-              <w:t xml:space="preserve">Form starts on screen ~3 of 5 · sticky “Prijavi dete” = 1 tap from anywhere</w:t>
+              <w:t xml:space="preserve">Form starts on screen ~3.5 of 5 · sticky “Prijavi dete” = 1 tap from anywhere</w:t>
             </w:r>
           </w:p>
         </w:tc>
@@ -354,11 +354,11 @@
             <w:tcW w:type="dxa" w:w="10546"/>
             <w:tcBorders>
               <w:top w:val="none" w:color="FFFFFF" w:sz="0"/>
-              <w:left w:val="single" w:color="D93B6A" w:sz="24"/>
+              <w:left w:val="single" w:color="0E9F85" w:sz="24"/>
               <w:bottom w:val="none" w:color="FFFFFF" w:sz="0"/>
               <w:right w:val="none" w:color="FFFFFF" w:sz="0"/>
             </w:tcBorders>
-            <w:shd w:fill="FFF1F5" w:color="auto" w:val="clear"/>
+            <w:shd w:fill="ECF8F4" w:color="auto" w:val="clear"/>
             <w:tcMar>
               <w:top w:type="dxa" w:w="90"/>
               <w:left w:type="dxa" w:w="160"/>
@@ -376,11 +376,11 @@
                 <w:rFonts w:ascii="Arial" w:cs="Arial" w:eastAsia="Arial" w:hAnsi="Arial"/>
                 <w:b/>
                 <w:bCs/>
-                <w:color w:val="D93B6A"/>
+                <w:color w:val="0E9F85"/>
                 <w:sz w:val="18"/>
                 <w:szCs w:val="18"/>
               </w:rPr>
-              <w:t xml:space="preserve">Fix before any ad goes live — the site and the ads disagree</w:t>
+              <w:t xml:space="preserve">Resolved — the live site wins. Ads and all creative docs are updated to match it.</w:t>
             </w:r>
           </w:p>
           <w:tbl>
@@ -397,9 +397,9 @@
             </w:tblPr>
             <w:tblGrid>
               <w:gridCol w:w="1500"/>
-              <w:gridCol w:w="1900"/>
-              <w:gridCol w:w="3100"/>
-              <w:gridCol w:w="3746"/>
+              <w:gridCol w:w="2900"/>
+              <w:gridCol w:w="2200"/>
+              <w:gridCol w:w="3646"/>
             </w:tblGrid>
             <w:tr>
               <w:trPr>
@@ -432,7 +432,7 @@
               </w:tc>
               <w:tc>
                 <w:tcPr>
-                  <w:tcW w:type="dxa" w:w="1900"/>
+                  <w:tcW w:type="dxa" w:w="2900"/>
                   <w:tcBorders>
                     <w:top w:val="single" w:color="D9E1EC" w:sz="4"/>
                     <w:left w:val="single" w:color="D9E1EC" w:sz="4"/>
@@ -461,13 +461,13 @@
                       <w:sz w:val="15"/>
                       <w:szCs w:val="15"/>
                     </w:rPr>
-                    <w:t xml:space="preserve">Site says</w:t>
+                    <w:t xml:space="preserve">Site (source of truth)</w:t>
                   </w:r>
                 </w:p>
               </w:tc>
               <w:tc>
                 <w:tcPr>
-                  <w:tcW w:type="dxa" w:w="3100"/>
+                  <w:tcW w:type="dxa" w:w="2200"/>
                   <w:tcBorders>
                     <w:top w:val="single" w:color="D9E1EC" w:sz="4"/>
                     <w:left w:val="single" w:color="D9E1EC" w:sz="4"/>
@@ -496,13 +496,13 @@
                       <w:sz w:val="15"/>
                       <w:szCs w:val="15"/>
                     </w:rPr>
-                    <w:t xml:space="preserve">Ads + our docs say</w:t>
+                    <w:t xml:space="preserve">Was in ads / docs</w:t>
                   </w:r>
                 </w:p>
               </w:tc>
               <w:tc>
                 <w:tcPr>
-                  <w:tcW w:type="dxa" w:w="3746"/>
+                  <w:tcW w:type="dxa" w:w="3646"/>
                   <w:tcBorders>
                     <w:top w:val="single" w:color="D9E1EC" w:sz="4"/>
                     <w:left w:val="single" w:color="D9E1EC" w:sz="4"/>
@@ -531,7 +531,7 @@
                       <w:sz w:val="15"/>
                       <w:szCs w:val="15"/>
                     </w:rPr>
-                    <w:t xml:space="preserve">Do</w:t>
+                    <w:t xml:space="preserve">Updated</w:t>
                   </w:r>
                 </w:p>
               </w:tc>
@@ -576,7 +576,7 @@
               </w:tc>
               <w:tc>
                 <w:tcPr>
-                  <w:tcW w:type="dxa" w:w="1900"/>
+                  <w:tcW w:type="dxa" w:w="2900"/>
                   <w:tcBorders>
                     <w:top w:val="single" w:color="D9E1EC" w:sz="4"/>
                     <w:left w:val="single" w:color="D9E1EC" w:sz="4"/>
@@ -610,7 +610,7 @@
               </w:tc>
               <w:tc>
                 <w:tcPr>
-                  <w:tcW w:type="dxa" w:w="3100"/>
+                  <w:tcW w:type="dxa" w:w="2200"/>
                   <w:tcBorders>
                     <w:top w:val="single" w:color="D9E1EC" w:sz="4"/>
                     <w:left w:val="single" w:color="D9E1EC" w:sz="4"/>
@@ -638,13 +638,13 @@
                       <w:sz w:val="15"/>
                       <w:szCs w:val="15"/>
                     </w:rPr>
-                    <w:t xml:space="preserve">6.400 RSD (C5, R1, briefs)</w:t>
+                    <w:t xml:space="preserve">6.400 RSD</w:t>
                   </w:r>
                 </w:p>
               </w:tc>
               <w:tc>
                 <w:tcPr>
-                  <w:tcW w:type="dxa" w:w="3746"/>
+                  <w:tcW w:type="dxa" w:w="3646"/>
                   <w:tcBorders>
                     <w:top w:val="single" w:color="D9E1EC" w:sz="4"/>
                     <w:left w:val="single" w:color="D9E1EC" w:sz="4"/>
@@ -672,7 +672,7 @@
                       <w:sz w:val="15"/>
                       <w:szCs w:val="15"/>
                     </w:rPr>
-                    <w:t xml:space="preserve">Mladen confirms today → we fix whichever side is wrong</w:t>
+                    <w:t xml:space="preserve">C5, R6, carousel card 7 · 1-pager, creative plan, short plan, briefs</w:t>
                   </w:r>
                 </w:p>
               </w:tc>
@@ -717,7 +717,7 @@
               </w:tc>
               <w:tc>
                 <w:tcPr>
-                  <w:tcW w:type="dxa" w:w="1900"/>
+                  <w:tcW w:type="dxa" w:w="2900"/>
                   <w:tcBorders>
                     <w:top w:val="single" w:color="D9E1EC" w:sz="4"/>
                     <w:left w:val="single" w:color="D9E1EC" w:sz="4"/>
@@ -745,13 +745,13 @@
                       <w:sz w:val="15"/>
                       <w:szCs w:val="15"/>
                     </w:rPr>
-                    <w:t xml:space="preserve">Mon 26 Oct, 18–20 h</w:t>
+                    <w:t xml:space="preserve">Mon 26 Oct, 18–20 h · come with your child · registration needed</w:t>
                   </w:r>
                 </w:p>
               </w:tc>
               <w:tc>
                 <w:tcPr>
-                  <w:tcW w:type="dxa" w:w="3100"/>
+                  <w:tcW w:type="dxa" w:w="2200"/>
                   <w:tcBorders>
                     <w:top w:val="single" w:color="D9E1EC" w:sz="4"/>
                     <w:left w:val="single" w:color="D9E1EC" w:sz="4"/>
@@ -779,13 +779,13 @@
                       <w:sz w:val="15"/>
                       <w:szCs w:val="15"/>
                     </w:rPr>
-                    <w:t xml:space="preserve">Sat 24 Oct (C6, O1–O3, O3 countdown, weekly plan)</w:t>
+                    <w:t xml:space="preserve">Sat 24 Oct · “~90 min · besplatno”</w:t>
                   </w:r>
                 </w:p>
               </w:tc>
               <w:tc>
                 <w:tcPr>
-                  <w:tcW w:type="dxa" w:w="3746"/>
+                  <w:tcW w:type="dxa" w:w="3646"/>
                   <w:tcBorders>
                     <w:top w:val="single" w:color="D9E1EC" w:sz="4"/>
                     <w:left w:val="single" w:color="D9E1EC" w:sz="4"/>
@@ -813,7 +813,148 @@
                       <w:sz w:val="15"/>
                       <w:szCs w:val="15"/>
                     </w:rPr>
-                    <w:t xml:space="preserve">Confirm → we re-date mocks, countdown, weekly plan and briefs</w:t>
+                    <w:t xml:space="preserve">C6, O2 band, O3 countdown (“U ponedeljak!”), story · flight 12 → 26 Oct (stops 17 h) · weekly plan, briefs, photo list</w:t>
+                  </w:r>
+                </w:p>
+              </w:tc>
+            </w:tr>
+            <w:tr>
+              <w:trPr>
+                <w:cantSplit/>
+              </w:trPr>
+              <w:tc>
+                <w:tcPr>
+                  <w:tcW w:type="dxa" w:w="1500"/>
+                  <w:tcBorders>
+                    <w:top w:val="single" w:color="D9E1EC" w:sz="4"/>
+                    <w:left w:val="single" w:color="D9E1EC" w:sz="4"/>
+                    <w:bottom w:val="single" w:color="D9E1EC" w:sz="4"/>
+                    <w:right w:val="single" w:color="D9E1EC" w:sz="4"/>
+                  </w:tcBorders>
+                  <w:shd w:fill="F1F5F9" w:color="auto" w:val="clear"/>
+                  <w:tcMar>
+                    <w:top w:type="dxa" w:w="40"/>
+                    <w:left w:type="dxa" w:w="90"/>
+                    <w:bottom w:type="dxa" w:w="40"/>
+                    <w:right w:type="dxa" w:w="90"/>
+                  </w:tcMar>
+                  <w:vAlign w:val="center"/>
+                </w:tcPr>
+                <w:p>
+                  <w:pPr>
+                    <w:keepLines/>
+                    <w:spacing w:after="0" w:before="0" w:line="240"/>
+                  </w:pPr>
+                  <w:r>
+                    <w:rPr>
+                      <w:rFonts w:ascii="Arial" w:cs="Arial" w:eastAsia="Arial" w:hAnsi="Arial"/>
+                      <w:color w:val="1E293B"/>
+                      <w:sz w:val="15"/>
+                      <w:szCs w:val="15"/>
+                    </w:rPr>
+                    <w:t xml:space="preserve">Also aligned</w:t>
+                  </w:r>
+                </w:p>
+              </w:tc>
+              <w:tc>
+                <w:tcPr>
+                  <w:tcW w:type="dxa" w:w="2900"/>
+                  <w:tcBorders>
+                    <w:top w:val="single" w:color="D9E1EC" w:sz="4"/>
+                    <w:left w:val="single" w:color="D9E1EC" w:sz="4"/>
+                    <w:bottom w:val="single" w:color="D9E1EC" w:sz="4"/>
+                    <w:right w:val="single" w:color="D9E1EC" w:sz="4"/>
+                  </w:tcBorders>
+                  <w:shd w:fill="FFFFFF" w:color="auto" w:val="clear"/>
+                  <w:tcMar>
+                    <w:top w:type="dxa" w:w="40"/>
+                    <w:left w:type="dxa" w:w="90"/>
+                    <w:bottom w:type="dxa" w:w="40"/>
+                    <w:right w:type="dxa" w:w="90"/>
+                  </w:tcMar>
+                  <w:vAlign w:val="center"/>
+                </w:tcPr>
+                <w:p>
+                  <w:pPr>
+                    <w:keepLines/>
+                    <w:spacing w:after="0" w:before="0" w:line="240"/>
+                  </w:pPr>
+                  <w:r>
+                    <w:rPr>
+                      <w:rFonts w:ascii="Arial" w:cs="Arial" w:eastAsia="Arial" w:hAnsi="Arial"/>
+                      <w:color w:val="1E293B"/>
+                      <w:sz w:val="15"/>
+                      <w:szCs w:val="15"/>
+                    </w:rPr>
+                    <w:t xml:space="preserve">Level descriptions · “6 oblasti” · groups start together</w:t>
+                  </w:r>
+                </w:p>
+              </w:tc>
+              <w:tc>
+                <w:tcPr>
+                  <w:tcW w:type="dxa" w:w="2200"/>
+                  <w:tcBorders>
+                    <w:top w:val="single" w:color="D9E1EC" w:sz="4"/>
+                    <w:left w:val="single" w:color="D9E1EC" w:sz="4"/>
+                    <w:bottom w:val="single" w:color="D9E1EC" w:sz="4"/>
+                    <w:right w:val="single" w:color="D9E1EC" w:sz="4"/>
+                  </w:tcBorders>
+                  <w:shd w:fill="FFFFFF" w:color="auto" w:val="clear"/>
+                  <w:tcMar>
+                    <w:top w:type="dxa" w:w="40"/>
+                    <w:left w:type="dxa" w:w="90"/>
+                    <w:bottom w:type="dxa" w:w="40"/>
+                    <w:right w:type="dxa" w:w="90"/>
+                  </w:tcMar>
+                  <w:vAlign w:val="center"/>
+                </w:tcPr>
+                <w:p>
+                  <w:pPr>
+                    <w:keepLines/>
+                    <w:spacing w:after="0" w:before="0" w:line="240"/>
+                  </w:pPr>
+                  <w:r>
+                    <w:rPr>
+                      <w:rFonts w:ascii="Arial" w:cs="Arial" w:eastAsia="Arial" w:hAnsi="Arial"/>
+                      <w:color w:val="1E293B"/>
+                      <w:sz w:val="15"/>
+                      <w:szCs w:val="15"/>
+                    </w:rPr>
+                    <w:t xml:space="preserve">“6 veština” · older level copy</w:t>
+                  </w:r>
+                </w:p>
+              </w:tc>
+              <w:tc>
+                <w:tcPr>
+                  <w:tcW w:type="dxa" w:w="3646"/>
+                  <w:tcBorders>
+                    <w:top w:val="single" w:color="D9E1EC" w:sz="4"/>
+                    <w:left w:val="single" w:color="D9E1EC" w:sz="4"/>
+                    <w:bottom w:val="single" w:color="D9E1EC" w:sz="4"/>
+                    <w:right w:val="single" w:color="D9E1EC" w:sz="4"/>
+                  </w:tcBorders>
+                  <w:shd w:fill="FFFFFF" w:color="auto" w:val="clear"/>
+                  <w:tcMar>
+                    <w:top w:type="dxa" w:w="40"/>
+                    <w:left w:type="dxa" w:w="90"/>
+                    <w:bottom w:type="dxa" w:w="40"/>
+                    <w:right w:type="dxa" w:w="90"/>
+                  </w:tcMar>
+                  <w:vAlign w:val="center"/>
+                </w:tcPr>
+                <w:p>
+                  <w:pPr>
+                    <w:keepLines/>
+                    <w:spacing w:after="0" w:before="0" w:line="240"/>
+                  </w:pPr>
+                  <w:r>
+                    <w:rPr>
+                      <w:rFonts w:ascii="Arial" w:cs="Arial" w:eastAsia="Arial" w:hAnsi="Arial"/>
+                      <w:color w:val="1E293B"/>
+                      <w:sz w:val="15"/>
+                      <w:szCs w:val="15"/>
+                    </w:rPr>
+                    <w:t xml:space="preserve">C2 levels, carousel cards 1–2, R6 last call</w:t>
                   </w:r>
                 </w:p>
               </w:tc>
@@ -831,7 +972,7 @@
                 <w:sz w:val="14"/>
                 <w:szCs w:val="14"/>
               </w:rPr>
-              <w:t xml:space="preserve">A price or date that changes between ad and page costs trust instantly and looks misleading in Meta’s ad review.</w:t>
+              <w:t xml:space="preserve">Still open: is the Open Day free? The site doesn’t say, so “besplatno” is out of all creatives until Mladen confirms.</w:t>
             </w:r>
           </w:p>
         </w:tc>
@@ -3776,7 +3917,7 @@
                 <w:sz w:val="15"/>
                 <w:szCs w:val="15"/>
               </w:rPr>
-              <w:t xml:space="preserve">: 7 blocks, ~480 words. Homepage stays as is for organic and SEO.</w:t>
+              <w:t xml:space="preserve">: 7 blocks, ~530 words. Homepage stays as is for organic and SEO.</w:t>
             </w:r>
           </w:p>
         </w:tc>
@@ -4989,7 +5130,7 @@
                 <w:sz w:val="15"/>
                 <w:szCs w:val="15"/>
               </w:rPr>
-              <w:t xml:space="preserve">Fix the price + Open Day date so site = ads.</w:t>
+              <w:t xml:space="preserve">Site = source of truth: tell Paid before any price or date change.</w:t>
             </w:r>
           </w:p>
           <w:p>
@@ -5992,7 +6133,7 @@
                 <w:sz w:val="15"/>
                 <w:szCs w:val="15"/>
               </w:rPr>
-              <w:t xml:space="preserve">Explore · Create · Build · Lead — razred + trajanje časa</w:t>
+              <w:t xml:space="preserve">Explore · Create · Build · Lead — razred, trajanje časa, vreme za računarom (sajt)</w:t>
             </w:r>
           </w:p>
         </w:tc>
@@ -6133,7 +6274,7 @@
                 <w:sz w:val="15"/>
                 <w:szCs w:val="15"/>
               </w:rPr>
-              <w:t xml:space="preserve">My NXT Portfolio + Showcase + team faces</w:t>
+              <w:t xml:space="preserve">My NXT Portfolio + Future Skills Passport + Showcase + team faces</w:t>
             </w:r>
           </w:p>
         </w:tc>
@@ -6274,7 +6415,7 @@
                 <w:sz w:val="15"/>
                 <w:szCs w:val="15"/>
               </w:rPr>
-              <w:t xml:space="preserve">Founding 5.900 RSD, 6 uplata, sve uključeno · Open Day box as the soft option</w:t>
+              <w:t xml:space="preserve">Founding 5.900 RSD, 6 uplata, sve uključeno, regularna 7.200 · “grupe kreću zajedno” · Open Day box (pon 26. 10, 18–20 h)</w:t>
             </w:r>
           </w:p>
         </w:tc>
@@ -6308,7 +6449,7 @@
                 <w:sz w:val="15"/>
                 <w:szCs w:val="15"/>
               </w:rPr>
-              <w:t xml:space="preserve">Offer</w:t>
+              <w:t xml:space="preserve">Offer + real urgency</w:t>
             </w:r>
           </w:p>
         </w:tc>
@@ -6712,7 +6853,7 @@
           <w:sz w:val="15"/>
           <w:szCs w:val="15"/>
         </w:rPr>
-        <w:t xml:space="preserve"> — the form starts on screen ~3.3 (pink line); on the homepage it is the last section:</w:t>
+        <w:t xml:space="preserve"> — the form starts on screen ~3.5 (pink line); on the homepage it is the last section:</w:t>
       </w:r>
     </w:p>
     <w:p>
@@ -8354,6 +8495,210 @@
           <w:szCs w:val="14"/>
         </w:rPr>
         <w:t xml:space="preserve">“.g” = the blue→purple gradient text class; Viktor maps it to the site’s existing gradient style.</w:t>
+      </w:r>
+    </w:p>
+    <w:p>
+      <w:pPr>
+        <w:keepNext/>
+        <w:pageBreakBefore/>
+        <w:spacing w:after="70" w:before="0"/>
+      </w:pPr>
+      <w:r>
+        <w:rPr>
+          <w:rFonts w:ascii="Arial" w:cs="Arial" w:eastAsia="Arial" w:hAnsi="Arial"/>
+          <w:b/>
+          <w:bCs/>
+          <w:color w:val="007BFF"/>
+          <w:sz w:val="24"/>
+          <w:szCs w:val="24"/>
+        </w:rPr>
+        <w:t xml:space="preserve">9  </w:t>
+      </w:r>
+      <w:r>
+        <w:rPr>
+          <w:rFonts w:ascii="Arial" w:cs="Arial" w:eastAsia="Arial" w:hAnsi="Arial"/>
+          <w:b/>
+          <w:bCs/>
+          <w:color w:val="0F172A"/>
+          <w:sz w:val="24"/>
+          <w:szCs w:val="24"/>
+        </w:rPr>
+        <w:t xml:space="preserve">Comments on the prototype screens</w:t>
+      </w:r>
+    </w:p>
+    <w:p>
+      <w:pPr>
+        <w:keepLines/>
+        <w:spacing w:after="60" w:before="0" w:line="240"/>
+      </w:pPr>
+      <w:r>
+        <w:rPr>
+          <w:rFonts w:ascii="Arial" w:cs="Arial" w:eastAsia="Arial" w:hAnsi="Arial"/>
+          <w:color w:val="1E293B"/>
+          <w:sz w:val="15"/>
+          <w:szCs w:val="15"/>
+        </w:rPr>
+        <w:t xml:space="preserve">Numbered pins on the mobile page; blue = why it’s there, pink = to confirm / to do. Same images as PNGs in </w:t>
+      </w:r>
+      <w:r>
+        <w:rPr>
+          <w:rFonts w:ascii="Arial" w:cs="Arial" w:eastAsia="Arial" w:hAnsi="Arial"/>
+          <w:b/>
+          <w:bCs/>
+          <w:color w:val="1E293B"/>
+          <w:sz w:val="15"/>
+          <w:szCs w:val="15"/>
+        </w:rPr>
+        <w:t xml:space="preserve">landing-page/annotated/</w:t>
+      </w:r>
+      <w:r>
+        <w:rPr>
+          <w:rFonts w:ascii="Arial" w:cs="Arial" w:eastAsia="Arial" w:hAnsi="Arial"/>
+          <w:color w:val="1E293B"/>
+          <w:sz w:val="15"/>
+          <w:szCs w:val="15"/>
+        </w:rPr>
+        <w:t xml:space="preserve"> for Slack.</w:t>
+      </w:r>
+    </w:p>
+    <w:p>
+      <w:pPr>
+        <w:spacing w:after="0" w:before="40"/>
+        <w:jc w:val="center"/>
+      </w:pPr>
+      <w:r>
+        <w:drawing>
+          <wp:inline distT="0" distB="0" distL="0" distR="0">
+            <wp:extent cx="6572250" cy="5895975"/>
+            <wp:effectExtent t="0" r="0" b="0" l="0"/>
+            <wp:docPr id="1" name="LP_comments_1.png" descr="Annotated prototype screen 1" title="LP_comments_1.png"/>
+            <wp:cNvGraphicFramePr>
+              <a:graphicFrameLocks xmlns:a="http://schemas.openxmlformats.org/drawingml/2006/main" noChangeAspect="1"/>
+            </wp:cNvGraphicFramePr>
+            <a:graphic xmlns:a="http://schemas.openxmlformats.org/drawingml/2006/main">
+              <a:graphicData uri="http://schemas.openxmlformats.org/drawingml/2006/picture">
+                <pic:pic xmlns:pic="http://schemas.openxmlformats.org/drawingml/2006/picture">
+                  <pic:nvPicPr>
+                    <pic:cNvPr id="0" name="" descr=""/>
+                    <pic:cNvPicPr>
+                      <a:picLocks noChangeAspect="1" noChangeArrowheads="1"/>
+                    </pic:cNvPicPr>
+                  </pic:nvPicPr>
+                  <pic:blipFill>
+                    <a:blip r:embed="rId10" cstate="none"/>
+                    <a:srcRect/>
+                    <a:stretch>
+                      <a:fillRect/>
+                    </a:stretch>
+                  </pic:blipFill>
+                  <pic:spPr bwMode="auto">
+                    <a:xfrm>
+                      <a:off x="0" y="0"/>
+                      <a:ext cx="6572250" cy="5895975"/>
+                    </a:xfrm>
+                    <a:prstGeom prst="rect">
+                      <a:avLst/>
+                    </a:prstGeom>
+                  </pic:spPr>
+                </pic:pic>
+              </a:graphicData>
+            </a:graphic>
+          </wp:inline>
+        </w:drawing>
+      </w:r>
+    </w:p>
+    <w:p>
+      <w:pPr>
+        <w:pageBreakBefore/>
+        <w:spacing w:after="0" w:before="40"/>
+        <w:jc w:val="center"/>
+      </w:pPr>
+      <w:r>
+        <w:drawing>
+          <wp:inline distT="0" distB="0" distL="0" distR="0">
+            <wp:extent cx="5953125" cy="8181975"/>
+            <wp:effectExtent t="0" r="0" b="0" l="0"/>
+            <wp:docPr id="1" name="LP_comments_2.png" descr="Annotated prototype screen 2" title="LP_comments_2.png"/>
+            <wp:cNvGraphicFramePr>
+              <a:graphicFrameLocks xmlns:a="http://schemas.openxmlformats.org/drawingml/2006/main" noChangeAspect="1"/>
+            </wp:cNvGraphicFramePr>
+            <a:graphic xmlns:a="http://schemas.openxmlformats.org/drawingml/2006/main">
+              <a:graphicData uri="http://schemas.openxmlformats.org/drawingml/2006/picture">
+                <pic:pic xmlns:pic="http://schemas.openxmlformats.org/drawingml/2006/picture">
+                  <pic:nvPicPr>
+                    <pic:cNvPr id="0" name="" descr=""/>
+                    <pic:cNvPicPr>
+                      <a:picLocks noChangeAspect="1" noChangeArrowheads="1"/>
+                    </pic:cNvPicPr>
+                  </pic:nvPicPr>
+                  <pic:blipFill>
+                    <a:blip r:embed="rId11" cstate="none"/>
+                    <a:srcRect/>
+                    <a:stretch>
+                      <a:fillRect/>
+                    </a:stretch>
+                  </pic:blipFill>
+                  <pic:spPr bwMode="auto">
+                    <a:xfrm>
+                      <a:off x="0" y="0"/>
+                      <a:ext cx="5953125" cy="8181975"/>
+                    </a:xfrm>
+                    <a:prstGeom prst="rect">
+                      <a:avLst/>
+                    </a:prstGeom>
+                  </pic:spPr>
+                </pic:pic>
+              </a:graphicData>
+            </a:graphic>
+          </wp:inline>
+        </w:drawing>
+      </w:r>
+    </w:p>
+    <w:p>
+      <w:pPr>
+        <w:pageBreakBefore/>
+        <w:spacing w:after="0" w:before="40"/>
+        <w:jc w:val="center"/>
+      </w:pPr>
+      <w:r>
+        <w:drawing>
+          <wp:inline distT="0" distB="0" distL="0" distR="0">
+            <wp:extent cx="6572250" cy="7600950"/>
+            <wp:effectExtent t="0" r="0" b="0" l="0"/>
+            <wp:docPr id="1" name="LP_comments_3.png" descr="Annotated prototype screen 3" title="LP_comments_3.png"/>
+            <wp:cNvGraphicFramePr>
+              <a:graphicFrameLocks xmlns:a="http://schemas.openxmlformats.org/drawingml/2006/main" noChangeAspect="1"/>
+            </wp:cNvGraphicFramePr>
+            <a:graphic xmlns:a="http://schemas.openxmlformats.org/drawingml/2006/main">
+              <a:graphicData uri="http://schemas.openxmlformats.org/drawingml/2006/picture">
+                <pic:pic xmlns:pic="http://schemas.openxmlformats.org/drawingml/2006/picture">
+                  <pic:nvPicPr>
+                    <pic:cNvPr id="0" name="" descr=""/>
+                    <pic:cNvPicPr>
+                      <a:picLocks noChangeAspect="1" noChangeArrowheads="1"/>
+                    </pic:cNvPicPr>
+                  </pic:nvPicPr>
+                  <pic:blipFill>
+                    <a:blip r:embed="rId12" cstate="none"/>
+                    <a:srcRect/>
+                    <a:stretch>
+                      <a:fillRect/>
+                    </a:stretch>
+                  </pic:blipFill>
+                  <pic:spPr bwMode="auto">
+                    <a:xfrm>
+                      <a:off x="0" y="0"/>
+                      <a:ext cx="6572250" cy="7600950"/>
+                    </a:xfrm>
+                    <a:prstGeom prst="rect">
+                      <a:avLst/>
+                    </a:prstGeom>
+                  </pic:spPr>
+                </pic:pic>
+              </a:graphicData>
+            </a:graphic>
+          </wp:inline>
+        </w:drawing>
       </w:r>
     </w:p>
     <w:sectPr>

</xml_diff>